<commit_message>
Add ICG20660L V2 measurement and analysis tools
Added new Arduino firmware for ICG20660L V2 calibration, Python scripts for data analysis and serial data storage, and updated calibration data files. Removed outdated calibration data and updated documentation file.
</commit_message>
<xml_diff>
--- a/V1/UT/UT_Daniel_Rebrov_25_26.docx
+++ b/V1/UT/UT_Daniel_Rebrov_25_26.docx
@@ -1718,30 +1718,29 @@
         <w:t xml:space="preserve">“. Seejuures </w:t>
       </w:r>
       <w:r>
-        <w:t xml:space="preserve">vaadatakse, kas statiivi kasutamine anduri asetamiseks </w:t>
-      </w:r>
-      <w:r>
-        <w:t xml:space="preserve">kindlatesse </w:t>
-      </w:r>
-      <w:r>
-        <w:t>eri asenditesse võib anda täpsemaid tulemusi kui teadustöös kirjeldatud anduri asetamine suvalistesse positsioonidesse</w:t>
-      </w:r>
-      <w:r>
-        <w:t xml:space="preserve"> käsitsi</w:t>
-      </w:r>
-      <w:r>
-        <w:t>.</w:t>
-      </w:r>
-      <w:r>
-        <w:t xml:space="preserve"> </w:t>
-      </w:r>
-    </w:p>
-    <w:p>
-      <w:r>
-        <w:t xml:space="preserve">Teema on aktuaalne, sest sellist võrdlust ei ole varem teadustöödes </w:t>
-      </w:r>
-      <w:r>
-        <w:t>tehtud</w:t>
+        <w:t xml:space="preserve">vaadatakse, kas </w:t>
+      </w:r>
+      <w:r>
+        <w:t>autori loodud lihtsa suunamisalgoritmi kasutamine viib täpsemate kalibreerimistulemusteni ning võrreldakse ka mitme kalibreerimise korral saadavate parameetrite erinevust. Kalibreerimise täpsust hinnatakse kahel viisil. Esiteks rakendatakse saadud kalibreerimisparameetrid sõltumatule andmehulgale, mis on saadud kolmel teljel pööratava statiiviga. Teiseks kasutatakse servomootorit, et uurida güroskoobi täpsust enne ning pärast kalibreerimist.</w:t>
+      </w:r>
+    </w:p>
+    <w:p>
+      <w:r>
+        <w:t xml:space="preserve">Uurimistöö </w:t>
+      </w:r>
+      <w:r>
+        <w:t xml:space="preserve">on aktuaalne, sest sellise võrdluse tegemisega on võimalik saada aimu sellest, </w:t>
+      </w:r>
+      <w:r>
+        <w:t xml:space="preserve">kuidas on kõige täpsemalt ning usaldusväärsemalt võimalik </w:t>
+      </w:r>
+      <w:proofErr w:type="spellStart"/>
+      <w:r>
+        <w:t>inertsiaalandurit</w:t>
+      </w:r>
+      <w:proofErr w:type="spellEnd"/>
+      <w:r>
+        <w:t xml:space="preserve"> kasutada</w:t>
       </w:r>
       <w:r>
         <w:t xml:space="preserve">. See </w:t>
@@ -1761,7 +1760,16 @@
       </w:r>
       <w:proofErr w:type="spellEnd"/>
       <w:r>
-        <w:t xml:space="preserve"> kasutatavates eksperimentaalsetes lahendustes. Valisin uurimiseks just selle valdkonna, kuna olen seotud Tartu Ülikooli üliõpilasprojekti </w:t>
+        <w:t xml:space="preserve"> kasutatavates eksperimentaalsetes lahendustes</w:t>
+      </w:r>
+      <w:r>
+        <w:t xml:space="preserve">, näiteks droonides, robotites ja </w:t>
+      </w:r>
+      <w:r>
+        <w:t>liikumist jälgivates seadmetes.</w:t>
+      </w:r>
+      <w:r>
+        <w:t xml:space="preserve"> Valisin uurimiseks just selle valdkonna, kuna olen seotud Tartu Ülikooli üliõpilasprojekti </w:t>
       </w:r>
       <w:proofErr w:type="spellStart"/>
       <w:r>
@@ -1782,6 +1790,7 @@
     </w:p>
     <w:p>
       <w:r>
+        <w:lastRenderedPageBreak/>
         <w:t>Teoreetilise osa käigus uurin MEMS- tüüpi inertsiaalanduri põhikoostisosade tööpõhimõtet</w:t>
       </w:r>
       <w:r>
@@ -1791,11 +1800,7 @@
         <w:t>. Metoodika osas selgitan matemaatikat kalibreerimismeetodi taga ning selgitan, kuidas valmis minu testalus. Katselises osas viin läbi 3 mõõtmist nii käsitsi kui ka kasutades enda valmistatud mehhaanilist testalust ning hindan, kumb andmete kogumise viis on usaldusväärsem. Usaldusväärsust hinnatakse kolme kriteeriumi alusel. Esiteks, v</w:t>
       </w:r>
       <w:r>
-        <w:t xml:space="preserve">õrreldakse sama mõõtevahendiga tehtud erinevaid </w:t>
-      </w:r>
-      <w:r>
-        <w:lastRenderedPageBreak/>
-        <w:t>mõõtmisi: mida suurem on suhteline erinevus kalibreerimisparameetritel, seda väiksem on andmete usaldusväärsus. Teiseks kontrollitakse, kui hästi sobituvad leitud kalibreerimisparameetrid algsete andmetega – mida suuremad on muud vead mõõtmisel, seda halvemini sobituvad kalibreeritud andmed omavahel. Kolmandaks proovitakse leida absoluutne viga kasutades 3D-prinditud testseadet, millega on võimalik sensorit asetada igale küljele.</w:t>
+        <w:t>õrreldakse sama mõõtevahendiga tehtud erinevaid mõõtmisi: mida suurem on suhteline erinevus kalibreerimisparameetritel, seda väiksem on andmete usaldusväärsus. Teiseks kontrollitakse, kui hästi sobituvad leitud kalibreerimisparameetrid algsete andmetega – mida suuremad on muud vead mõõtmisel, seda halvemini sobituvad kalibreeritud andmed omavahel. Kolmandaks proovitakse leida absoluutne viga kasutades 3D-prinditud testseadet, millega on võimalik sensorit asetada igale küljele.</w:t>
       </w:r>
     </w:p>
     <w:p/>
@@ -1923,7 +1928,178 @@
     <w:p>
       <w:r>
         <w:lastRenderedPageBreak/>
-        <w:br w:type="page"/>
+        <w:t>Uurimisprobleem:</w:t>
+      </w:r>
+    </w:p>
+    <w:p>
+      <w:r>
+        <w:t xml:space="preserve">Kas suunamisalgoritmi kasutamine IMU käsitsi </w:t>
+      </w:r>
+      <w:proofErr w:type="spellStart"/>
+      <w:r>
+        <w:t>kalibreemise</w:t>
+      </w:r>
+      <w:proofErr w:type="spellEnd"/>
+      <w:r>
+        <w:t xml:space="preserve"> meetodi rakendamisel annab järjepidevamaid ja täpsemaid tulemusi? </w:t>
+      </w:r>
+    </w:p>
+    <w:p>
+      <w:r>
+        <w:t>Uurimisküsimused:</w:t>
+      </w:r>
+    </w:p>
+    <w:p>
+      <w:pPr>
+        <w:pStyle w:val="ListParagraph"/>
+        <w:numPr>
+          <w:ilvl w:val="0"/>
+          <w:numId w:val="5"/>
+        </w:numPr>
+      </w:pPr>
+      <w:r>
+        <w:t xml:space="preserve">Miks tekib </w:t>
+      </w:r>
+      <w:proofErr w:type="spellStart"/>
+      <w:r>
+        <w:t>inertsiaal</w:t>
+      </w:r>
+      <w:r>
+        <w:t>anduri</w:t>
+      </w:r>
+      <w:proofErr w:type="spellEnd"/>
+      <w:r>
+        <w:t xml:space="preserve"> kalibreeritav süstemaatiline mõõteviga</w:t>
+      </w:r>
+      <w:r>
+        <w:t>?</w:t>
+      </w:r>
+      <w:r>
+        <w:t xml:space="preserve"> </w:t>
+      </w:r>
+    </w:p>
+    <w:p>
+      <w:pPr>
+        <w:pStyle w:val="ListParagraph"/>
+        <w:numPr>
+          <w:ilvl w:val="0"/>
+          <w:numId w:val="5"/>
+        </w:numPr>
+      </w:pPr>
+      <w:r>
+        <w:t>Kas kalibreerimine enda loodud anduri suunajaga annab täpsemini kalibreeritud anduri kui abivahenditeta käsitsi kalibreerimine?</w:t>
+      </w:r>
+    </w:p>
+    <w:p>
+      <w:pPr>
+        <w:pStyle w:val="ListParagraph"/>
+        <w:numPr>
+          <w:ilvl w:val="1"/>
+          <w:numId w:val="5"/>
+        </w:numPr>
+      </w:pPr>
+      <w:r>
+        <w:t>Kui hästi on sobituvad leitud parameetrid iseseisvate, statiiviga saadud andmetega?</w:t>
+      </w:r>
+    </w:p>
+    <w:p>
+      <w:pPr>
+        <w:pStyle w:val="ListParagraph"/>
+        <w:numPr>
+          <w:ilvl w:val="1"/>
+          <w:numId w:val="5"/>
+        </w:numPr>
+      </w:pPr>
+      <w:r>
+        <w:t>Kui suur tuleb viga nurga mõõtmisel güroskoobi abil?</w:t>
+      </w:r>
+    </w:p>
+    <w:p>
+      <w:pPr>
+        <w:pStyle w:val="ListParagraph"/>
+        <w:numPr>
+          <w:ilvl w:val="0"/>
+          <w:numId w:val="5"/>
+        </w:numPr>
+      </w:pPr>
+      <w:r>
+        <w:t>Kuidas mõjutab suunaja kasutamine anduri kalibreerimise tulemuste järjepidevust?</w:t>
+      </w:r>
+    </w:p>
+    <w:p/>
+    <w:p>
+      <w:pPr>
+        <w:pStyle w:val="ListParagraph"/>
+        <w:numPr>
+          <w:ilvl w:val="0"/>
+          <w:numId w:val="4"/>
+        </w:numPr>
+      </w:pPr>
+      <w:r>
+        <w:t>Küsimusele 2 vastates saab ka teada, kui palju loeb kalibreerimisel muu mõõteviga, näiteks mingisugune värin või anduri mürataust</w:t>
+      </w:r>
+      <w:r>
+        <w:t xml:space="preserve"> ja kui palju loeb ebaühtlane katsetulemuste paigutumine</w:t>
+      </w:r>
+    </w:p>
+    <w:p>
+      <w:pPr>
+        <w:pStyle w:val="ListParagraph"/>
+        <w:numPr>
+          <w:ilvl w:val="0"/>
+          <w:numId w:val="4"/>
+        </w:numPr>
+      </w:pPr>
+      <w:r>
+        <w:t>Küsimuse 2 hüpotees: tulemused on täpsemad, sest andmete kogumine ühtlaselt üle terve sfääri pinna võimaldab kõige paremini kaardistada kõikidel erinevatel telgedel esinevaid vigasid.</w:t>
+      </w:r>
+    </w:p>
+    <w:p>
+      <w:pPr>
+        <w:pStyle w:val="ListParagraph"/>
+        <w:numPr>
+          <w:ilvl w:val="0"/>
+          <w:numId w:val="4"/>
+        </w:numPr>
+      </w:pPr>
+      <w:r>
+        <w:t>Tähtis: katse õnnestumiseks tuleb võtta sama kogus mõõtmisi lähteandmeteks, sest vastasel juhul mängivad rolli muud tegurid – iga lisanduva andmepunktiga on programmil keerulisem parameetreid leida ja seega keskmine erinevus tuleb suurem.</w:t>
+      </w:r>
+    </w:p>
+    <w:p>
+      <w:pPr>
+        <w:pStyle w:val="ListParagraph"/>
+        <w:numPr>
+          <w:ilvl w:val="0"/>
+          <w:numId w:val="4"/>
+        </w:numPr>
+        <w:rPr>
+          <w:b/>
+          <w:bCs/>
+        </w:rPr>
+      </w:pPr>
+      <w:r>
+        <w:rPr>
+          <w:b/>
+          <w:bCs/>
+        </w:rPr>
+        <w:t xml:space="preserve">Tegelikult on juba </w:t>
+      </w:r>
+      <w:proofErr w:type="spellStart"/>
+      <w:r>
+        <w:rPr>
+          <w:b/>
+          <w:bCs/>
+        </w:rPr>
+        <w:t>droone</w:t>
+      </w:r>
+      <w:proofErr w:type="spellEnd"/>
+      <w:r>
+        <w:rPr>
+          <w:b/>
+          <w:bCs/>
+        </w:rPr>
+        <w:t>, mille kalibreerimiseks peabki nad panema erinevatesse positsioonidesse ehk kasutama suunamisalgoritmiga kalibreerimist.</w:t>
       </w:r>
     </w:p>
     <w:p/>
@@ -1934,6 +2110,7 @@
       </w:pPr>
       <w:bookmarkStart w:id="1" w:name="_Toc193461394"/>
       <w:r>
+        <w:lastRenderedPageBreak/>
         <w:t>Pealkiri 1 (teoreetiline osa)</w:t>
       </w:r>
       <w:bookmarkEnd w:id="1"/>
@@ -2937,6 +3114,95 @@
       </w:rPr>
     </w:lvl>
   </w:abstractNum>
+  <w:abstractNum w:abstractNumId="4" w15:restartNumberingAfterBreak="0">
+    <w:nsid w:val="7E93240E"/>
+    <w:multiLevelType w:val="hybridMultilevel"/>
+    <w:tmpl w:val="270E8E74"/>
+    <w:lvl w:ilvl="0" w:tplc="0425000F">
+      <w:start w:val="1"/>
+      <w:numFmt w:val="decimal"/>
+      <w:lvlText w:val="%1."/>
+      <w:lvlJc w:val="left"/>
+      <w:pPr>
+        <w:ind w:left="720" w:hanging="360"/>
+      </w:pPr>
+      <w:rPr>
+        <w:rFonts w:hint="default"/>
+      </w:rPr>
+    </w:lvl>
+    <w:lvl w:ilvl="1" w:tplc="04250019">
+      <w:start w:val="1"/>
+      <w:numFmt w:val="lowerLetter"/>
+      <w:lvlText w:val="%2."/>
+      <w:lvlJc w:val="left"/>
+      <w:pPr>
+        <w:ind w:left="1440" w:hanging="360"/>
+      </w:pPr>
+    </w:lvl>
+    <w:lvl w:ilvl="2" w:tplc="0425001B" w:tentative="1">
+      <w:start w:val="1"/>
+      <w:numFmt w:val="lowerRoman"/>
+      <w:lvlText w:val="%3."/>
+      <w:lvlJc w:val="right"/>
+      <w:pPr>
+        <w:ind w:left="2160" w:hanging="180"/>
+      </w:pPr>
+    </w:lvl>
+    <w:lvl w:ilvl="3" w:tplc="0425000F" w:tentative="1">
+      <w:start w:val="1"/>
+      <w:numFmt w:val="decimal"/>
+      <w:lvlText w:val="%4."/>
+      <w:lvlJc w:val="left"/>
+      <w:pPr>
+        <w:ind w:left="2880" w:hanging="360"/>
+      </w:pPr>
+    </w:lvl>
+    <w:lvl w:ilvl="4" w:tplc="04250019" w:tentative="1">
+      <w:start w:val="1"/>
+      <w:numFmt w:val="lowerLetter"/>
+      <w:lvlText w:val="%5."/>
+      <w:lvlJc w:val="left"/>
+      <w:pPr>
+        <w:ind w:left="3600" w:hanging="360"/>
+      </w:pPr>
+    </w:lvl>
+    <w:lvl w:ilvl="5" w:tplc="0425001B" w:tentative="1">
+      <w:start w:val="1"/>
+      <w:numFmt w:val="lowerRoman"/>
+      <w:lvlText w:val="%6."/>
+      <w:lvlJc w:val="right"/>
+      <w:pPr>
+        <w:ind w:left="4320" w:hanging="180"/>
+      </w:pPr>
+    </w:lvl>
+    <w:lvl w:ilvl="6" w:tplc="0425000F" w:tentative="1">
+      <w:start w:val="1"/>
+      <w:numFmt w:val="decimal"/>
+      <w:lvlText w:val="%7."/>
+      <w:lvlJc w:val="left"/>
+      <w:pPr>
+        <w:ind w:left="5040" w:hanging="360"/>
+      </w:pPr>
+    </w:lvl>
+    <w:lvl w:ilvl="7" w:tplc="04250019" w:tentative="1">
+      <w:start w:val="1"/>
+      <w:numFmt w:val="lowerLetter"/>
+      <w:lvlText w:val="%8."/>
+      <w:lvlJc w:val="left"/>
+      <w:pPr>
+        <w:ind w:left="5760" w:hanging="360"/>
+      </w:pPr>
+    </w:lvl>
+    <w:lvl w:ilvl="8" w:tplc="0425001B" w:tentative="1">
+      <w:start w:val="1"/>
+      <w:numFmt w:val="lowerRoman"/>
+      <w:lvlText w:val="%9."/>
+      <w:lvlJc w:val="right"/>
+      <w:pPr>
+        <w:ind w:left="6480" w:hanging="180"/>
+      </w:pPr>
+    </w:lvl>
+  </w:abstractNum>
   <w:num w:numId="1" w16cid:durableId="1279485636">
     <w:abstractNumId w:val="2"/>
   </w:num>
@@ -2948,6 +3214,9 @@
   </w:num>
   <w:num w:numId="4" w16cid:durableId="497699944">
     <w:abstractNumId w:val="3"/>
+  </w:num>
+  <w:num w:numId="5" w16cid:durableId="1058819030">
+    <w:abstractNumId w:val="4"/>
   </w:num>
 </w:numbering>
 </file>
@@ -3599,7 +3868,6 @@
   <w:style w:type="character" w:default="1" w:styleId="DefaultParagraphFont">
     <w:name w:val="Default Paragraph Font"/>
     <w:uiPriority w:val="1"/>
-    <w:semiHidden/>
     <w:unhideWhenUsed/>
   </w:style>
   <w:style w:type="table" w:default="1" w:styleId="TableNormal">

</xml_diff>